<commit_message>
P_RES-129: simplification des CDC, services par étage et routage statique impose
</commit_message>
<xml_diff>
--- a/d-P_RES-129/H-P_RES-129_CDC.docx
+++ b/d-P_RES-129/H-P_RES-129_CDC.docx
@@ -8,13 +8,7 @@
         <w:spacing w:before="120"/>
       </w:pPr>
       <w:r>
-        <w:t>I</w:t>
-      </w:r>
-      <w:r>
-        <w:t xml:space="preserve">NFORMATIONS </w:t>
-      </w:r>
-      <w:r>
-        <w:t>GENERALES</w:t>
+        <w:t xml:space="preserve">INFORMATIONS GENERALES</w:t>
       </w:r>
     </w:p>
     <w:tbl>
@@ -54,20 +48,12 @@
                 <w:b/>
               </w:rPr>
             </w:pPr>
-            <w:proofErr w:type="gramStart"/>
             <w:r>
               <w:rPr>
                 <w:b/>
               </w:rPr>
-              <w:t>Elève</w:t>
+              <w:t>Elève:</w:t>
             </w:r>
-            <w:r>
-              <w:rPr>
-                <w:b/>
-              </w:rPr>
-              <w:t>:</w:t>
-            </w:r>
-            <w:proofErr w:type="gramEnd"/>
           </w:p>
         </w:tc>
         <w:tc>
@@ -81,14 +67,9 @@
             <w:pPr>
               <w:pStyle w:val="TexteTableau"/>
             </w:pPr>
-            <w:proofErr w:type="gramStart"/>
             <w:r>
-              <w:t>Nom</w:t>
+              <w:t>Nom:</w:t>
             </w:r>
-            <w:r>
-              <w:t>:</w:t>
-            </w:r>
-            <w:proofErr w:type="gramEnd"/>
           </w:p>
         </w:tc>
         <w:tc>
@@ -116,15 +97,8 @@
                 <w:tab w:val="left" w:pos="1026"/>
               </w:tabs>
             </w:pPr>
-            <w:proofErr w:type="gramStart"/>
             <w:r>
-              <w:t>Prénom</w:t>
-            </w:r>
-            <w:r>
-              <w:t>:</w:t>
-            </w:r>
-            <w:proofErr w:type="gramEnd"/>
-            <w:r>
+              <w:t>Prénom:</w:t>
               <w:tab/>
             </w:r>
           </w:p>
@@ -150,22 +124,8 @@
               <w:rPr>
                 <w:b/>
               </w:rPr>
-              <w:t xml:space="preserve">Lieu de </w:t>
+              <w:t xml:space="preserve">Lieu de travail:</w:t>
             </w:r>
-            <w:proofErr w:type="gramStart"/>
-            <w:r>
-              <w:rPr>
-                <w:b/>
-              </w:rPr>
-              <w:t>travail</w:t>
-            </w:r>
-            <w:r>
-              <w:rPr>
-                <w:b/>
-              </w:rPr>
-              <w:t>:</w:t>
-            </w:r>
-            <w:proofErr w:type="gramEnd"/>
           </w:p>
         </w:tc>
         <w:tc>
@@ -224,34 +184,7 @@
                 <w:sz w:val="28"/>
                 <w:szCs w:val="28"/>
               </w:rPr>
-              <w:t xml:space="preserve">Période de </w:t>
-            </w:r>
-            <w:r>
-              <w:rPr>
-                <w:rFonts w:ascii="Calibri" w:hAnsi="Calibri" w:cs="Arial"/>
-                <w:b/>
-                <w:sz w:val="28"/>
-                <w:szCs w:val="28"/>
-              </w:rPr>
-              <w:t>r</w:t>
-            </w:r>
-            <w:r>
-              <w:rPr>
-                <w:rFonts w:ascii="Calibri" w:hAnsi="Calibri" w:cs="Arial"/>
-                <w:b/>
-                <w:sz w:val="28"/>
-                <w:szCs w:val="28"/>
-              </w:rPr>
-              <w:t>éalisation</w:t>
-            </w:r>
-            <w:r>
-              <w:rPr>
-                <w:rFonts w:ascii="Calibri" w:hAnsi="Calibri" w:cs="Arial"/>
-                <w:b/>
-                <w:sz w:val="28"/>
-                <w:szCs w:val="28"/>
-              </w:rPr>
-              <w:t> :</w:t>
+              <w:t xml:space="preserve">Période de réalisation :</w:t>
             </w:r>
           </w:p>
         </w:tc>
@@ -349,10 +282,7 @@
         <w:pStyle w:val="Titre1"/>
       </w:pPr>
       <w:r>
-        <w:t>P</w:t>
-      </w:r>
-      <w:r>
-        <w:t>ROCÉDURE</w:t>
+        <w:t>PROCÉDURE</w:t>
       </w:r>
     </w:p>
     <w:p>
@@ -506,7 +436,35 @@
         <w:t>journal de travail</w:t>
       </w:r>
       <w:r>
-        <w:t xml:space="preserve"> au format texte (.txt) décrivant l’avancement du projet jour après jour (ce journal doit être remis avec les autres livrables). </w:t>
+        <w:t xml:space="preserve"> au format Markdown (.md) décrivant l’avancement du projet jour après jour (ce journal doit être remis avec les autres livrables). </w:t>
+      </w:r>
+    </w:p>
+    <w:p>
+      <w:pPr>
+        <w:pStyle w:val="Corpsdetexte"/>
+        <w:widowControl w:val="0"/>
+        <w:numPr>
+          <w:ilvl w:val="0"/>
+          <w:numId w:val="35"/>
+        </w:numPr>
+        <w:tabs>
+          <w:tab w:val="left" w:pos="709"/>
+        </w:tabs>
+        <w:suppressAutoHyphens/>
+        <w:spacing w:after="0"/>
+        <w:jc w:val="left"/>
+      </w:pPr>
+      <w:r>
+        <w:t xml:space="preserve">Rédiger une </w:t>
+      </w:r>
+      <w:r>
+        <w:rPr>
+          <w:rStyle w:val="lev"/>
+        </w:rPr>
+        <w:t>documentation de configuration</w:t>
+      </w:r>
+      <w:r>
+        <w:t xml:space="preserve"> au format .docx ou .md, présentant toutes les commandes utilisées et expliquant comment la configuration a été réalisée.</w:t>
       </w:r>
     </w:p>
     <w:p>
@@ -534,7 +492,7 @@
         <w:t>présentation</w:t>
       </w:r>
       <w:r>
-        <w:t xml:space="preserve"> synthétisant la démarche et la solution : schéma réseau, plan d’adressage, démonstration des commandes configurées dans Packet Tracer et justification des choix techniques. </w:t>
+        <w:t xml:space="preserve"> en vue de l’oral évalué, synthétisant la démarche et la solution : schéma réseau, plan d’adressage, démonstration des commandes configurées dans Packet Tracer et justification des choix techniques. Aucun rapport écrit n’est demandé : l’évaluation porte sur l’oral et les livrables. </w:t>
       </w:r>
     </w:p>
     <w:p>
@@ -552,10 +510,7 @@
         <w:keepLines/>
       </w:pPr>
       <w:r>
-        <w:t>T</w:t>
-      </w:r>
-      <w:r>
-        <w:t>ITRE</w:t>
+        <w:t>TITRE</w:t>
       </w:r>
     </w:p>
     <w:tbl>
@@ -595,10 +550,7 @@
         <w:keepLines/>
       </w:pPr>
       <w:r>
-        <w:t>S</w:t>
-      </w:r>
-      <w:r>
-        <w:t>UJET</w:t>
+        <w:t>SUJET</w:t>
       </w:r>
     </w:p>
     <w:tbl>
@@ -645,10 +597,7 @@
         </w:pBdr>
       </w:pPr>
       <w:r>
-        <w:t>M</w:t>
-      </w:r>
-      <w:r>
-        <w:t>ATÉRIEL ET LOGICIEL À DISPOSITION</w:t>
+        <w:t>MATÉRIEL ET LOGICIEL À DISPOSITION</w:t>
       </w:r>
     </w:p>
     <w:tbl>
@@ -683,27 +632,7 @@
               <w:rPr>
                 <w:lang w:val="en-US"/>
               </w:rPr>
-              <w:t>Poste</w:t>
-            </w:r>
-            <w:r>
-              <w:rPr>
-                <w:lang w:val="en-US"/>
-              </w:rPr>
-              <w:t xml:space="preserve"> de travail de </w:t>
-            </w:r>
-            <w:proofErr w:type="spellStart"/>
-            <w:r>
-              <w:rPr>
-                <w:lang w:val="en-US"/>
-              </w:rPr>
-              <w:t>l’ETML</w:t>
-            </w:r>
-            <w:proofErr w:type="spellEnd"/>
-            <w:r>
-              <w:rPr>
-                <w:lang w:val="en-US"/>
-              </w:rPr>
-              <w:t>.</w:t>
+              <w:t xml:space="preserve">Poste de travail de l’ETML.</w:t>
             </w:r>
           </w:p>
           <w:p>
@@ -717,33 +646,11 @@
                 <w:lang w:val="en-US"/>
               </w:rPr>
             </w:pPr>
-            <w:proofErr w:type="spellStart"/>
             <w:r>
               <w:rPr>
                 <w:lang w:val="en-US"/>
               </w:rPr>
-              <w:t>Oracel</w:t>
-            </w:r>
-            <w:proofErr w:type="spellEnd"/>
-            <w:r>
-              <w:rPr>
-                <w:lang w:val="en-US"/>
-              </w:rPr>
-              <w:t xml:space="preserve"> </w:t>
-            </w:r>
-            <w:proofErr w:type="spellStart"/>
-            <w:r>
-              <w:rPr>
-                <w:lang w:val="en-US"/>
-              </w:rPr>
-              <w:t>VitrualBox</w:t>
-            </w:r>
-            <w:proofErr w:type="spellEnd"/>
-            <w:r>
-              <w:rPr>
-                <w:lang w:val="en-US"/>
-              </w:rPr>
-              <w:t xml:space="preserve"> </w:t>
+              <w:t xml:space="preserve">Oracel VitrualBox </w:t>
             </w:r>
           </w:p>
           <w:p>
@@ -757,69 +664,11 @@
                 <w:lang w:val="en-US"/>
               </w:rPr>
             </w:pPr>
-            <w:proofErr w:type="spellStart"/>
             <w:r>
               <w:rPr>
                 <w:lang w:val="en-US"/>
               </w:rPr>
-              <w:t>Outils</w:t>
-            </w:r>
-            <w:proofErr w:type="spellEnd"/>
-            <w:r>
-              <w:rPr>
-                <w:lang w:val="en-US"/>
-              </w:rPr>
-              <w:t xml:space="preserve"> de </w:t>
-            </w:r>
-            <w:proofErr w:type="spellStart"/>
-            <w:proofErr w:type="gramStart"/>
-            <w:r>
-              <w:rPr>
-                <w:lang w:val="en-US"/>
-              </w:rPr>
-              <w:t>schématisation</w:t>
-            </w:r>
-            <w:proofErr w:type="spellEnd"/>
-            <w:r>
-              <w:rPr>
-                <w:lang w:val="en-US"/>
-              </w:rPr>
-              <w:t xml:space="preserve"> :</w:t>
-            </w:r>
-            <w:proofErr w:type="gramEnd"/>
-            <w:r>
-              <w:rPr>
-                <w:lang w:val="en-US"/>
-              </w:rPr>
-              <w:t xml:space="preserve"> draw.io, Visio </w:t>
-            </w:r>
-            <w:proofErr w:type="spellStart"/>
-            <w:r>
-              <w:rPr>
-                <w:lang w:val="en-US"/>
-              </w:rPr>
-              <w:t>ou</w:t>
-            </w:r>
-            <w:proofErr w:type="spellEnd"/>
-            <w:r>
-              <w:rPr>
-                <w:lang w:val="en-US"/>
-              </w:rPr>
-              <w:t xml:space="preserve"> </w:t>
-            </w:r>
-            <w:proofErr w:type="spellStart"/>
-            <w:r>
-              <w:rPr>
-                <w:lang w:val="en-US"/>
-              </w:rPr>
-              <w:t>équivalent</w:t>
-            </w:r>
-            <w:proofErr w:type="spellEnd"/>
-            <w:r>
-              <w:rPr>
-                <w:lang w:val="en-US"/>
-              </w:rPr>
-              <w:t xml:space="preserve">. </w:t>
+              <w:t xml:space="preserve">Outils de schématisation : draw.io, Visio ou équivalent. </w:t>
             </w:r>
           </w:p>
           <w:p>
@@ -833,47 +682,11 @@
                 <w:lang w:val="en-US"/>
               </w:rPr>
             </w:pPr>
-            <w:proofErr w:type="spellStart"/>
             <w:r>
               <w:rPr>
                 <w:lang w:val="en-US"/>
               </w:rPr>
-              <w:t>Simulateur</w:t>
-            </w:r>
-            <w:proofErr w:type="spellEnd"/>
-            <w:r>
-              <w:rPr>
-                <w:lang w:val="en-US"/>
-              </w:rPr>
-              <w:t xml:space="preserve"> </w:t>
-            </w:r>
-            <w:proofErr w:type="gramStart"/>
-            <w:r>
-              <w:rPr>
-                <w:lang w:val="en-US"/>
-              </w:rPr>
-              <w:t>réseau :</w:t>
-            </w:r>
-            <w:proofErr w:type="gramEnd"/>
-            <w:r>
-              <w:rPr>
-                <w:lang w:val="en-US"/>
-              </w:rPr>
-              <w:t xml:space="preserve"> Cisco Packet Tracer </w:t>
-            </w:r>
-            <w:proofErr w:type="spellStart"/>
-            <w:r>
-              <w:rPr>
-                <w:lang w:val="en-US"/>
-              </w:rPr>
-              <w:t>en</w:t>
-            </w:r>
-            <w:proofErr w:type="spellEnd"/>
-            <w:r>
-              <w:rPr>
-                <w:lang w:val="en-US"/>
-              </w:rPr>
-              <w:t xml:space="preserve"> mode CLI. </w:t>
+              <w:t xml:space="preserve">Simulateur réseau : Cisco Packet Tracer en mode CLI. </w:t>
             </w:r>
           </w:p>
           <w:p>
@@ -887,33 +700,11 @@
                 <w:lang w:val="en-US"/>
               </w:rPr>
             </w:pPr>
-            <w:proofErr w:type="spellStart"/>
             <w:r>
               <w:rPr>
                 <w:lang w:val="en-US"/>
               </w:rPr>
-              <w:t>Éditeur</w:t>
-            </w:r>
-            <w:proofErr w:type="spellEnd"/>
-            <w:r>
-              <w:rPr>
-                <w:lang w:val="en-US"/>
-              </w:rPr>
-              <w:t xml:space="preserve"> de </w:t>
-            </w:r>
-            <w:proofErr w:type="spellStart"/>
-            <w:r>
-              <w:rPr>
-                <w:lang w:val="en-US"/>
-              </w:rPr>
-              <w:t>texte</w:t>
-            </w:r>
-            <w:proofErr w:type="spellEnd"/>
-            <w:r>
-              <w:rPr>
-                <w:lang w:val="en-US"/>
-              </w:rPr>
-              <w:t xml:space="preserve"> pour le journal de travail. </w:t>
+              <w:t xml:space="preserve">Éditeur de texte pour le journal de travail. </w:t>
             </w:r>
           </w:p>
           <w:p>
@@ -927,33 +718,11 @@
                 <w:lang w:val="en-US"/>
               </w:rPr>
             </w:pPr>
-            <w:proofErr w:type="spellStart"/>
             <w:r>
               <w:rPr>
                 <w:lang w:val="en-US"/>
               </w:rPr>
-              <w:t>Accès</w:t>
-            </w:r>
-            <w:proofErr w:type="spellEnd"/>
-            <w:r>
-              <w:rPr>
-                <w:lang w:val="en-US"/>
-              </w:rPr>
-              <w:t xml:space="preserve"> aux cahiers des charges </w:t>
-            </w:r>
-            <w:proofErr w:type="spellStart"/>
-            <w:r>
-              <w:rPr>
-                <w:lang w:val="en-US"/>
-              </w:rPr>
-              <w:t>fournis</w:t>
-            </w:r>
-            <w:proofErr w:type="spellEnd"/>
-            <w:r>
-              <w:rPr>
-                <w:lang w:val="en-US"/>
-              </w:rPr>
-              <w:t xml:space="preserve">. </w:t>
+              <w:t xml:space="preserve">Accès aux cahiers des charges fournis. </w:t>
             </w:r>
           </w:p>
         </w:tc>
@@ -969,10 +738,7 @@
         </w:pBdr>
       </w:pPr>
       <w:r>
-        <w:t>P</w:t>
-      </w:r>
-      <w:r>
-        <w:t>RÉREQUIS</w:t>
+        <w:t>PRÉREQUIS</w:t>
       </w:r>
     </w:p>
     <w:p>
@@ -1083,10 +849,7 @@
         <w:jc w:val="left"/>
       </w:pPr>
       <w:r>
-        <w:t>La création d’un schéma réseau</w:t>
-      </w:r>
-      <w:r>
-        <w:t>.</w:t>
+        <w:t>La création d’un schéma réseau.</w:t>
       </w:r>
     </w:p>
     <w:p>
@@ -1105,7 +868,7 @@
         <w:jc w:val="left"/>
       </w:pPr>
       <w:r>
-        <w:t xml:space="preserve">La définition d’un plan d’adressage IP avec segmentation en VLAN et attribution claire des adresses. </w:t>
+        <w:t xml:space="preserve">La définition d’un plan d’adressage IP avec segmentation en VLAN et attribution claire des adresses. Tous les VLANs doivent pouvoir communiquer entre eux : le routage inter-VLAN est complet et automatique, aucune restriction d’accès entre VLANs n’est demandée. </w:t>
       </w:r>
     </w:p>
     <w:p>
@@ -1125,6 +888,31 @@
       </w:pPr>
       <w:r>
         <w:t xml:space="preserve">La configuration et la validation de la solution dans Packet Tracer via le CLI. </w:t>
+      </w:r>
+    </w:p>
+    <w:p>
+      <w:pPr>
+        <w:pStyle w:val="Corpsdetexte"/>
+        <w:widowControl w:val="0"/>
+        <w:numPr>
+          <w:ilvl w:val="0"/>
+          <w:numId w:val="37"/>
+        </w:numPr>
+        <w:tabs>
+          <w:tab w:val="left" w:pos="709"/>
+        </w:tabs>
+        <w:suppressAutoHyphens/>
+        <w:spacing w:after="0"/>
+        <w:jc w:val="left"/>
+      </w:pPr>
+      <w:r>
+        <w:rPr>
+          <w:rStyle w:val="lev"/>
+        </w:rPr>
+        <w:t xml:space="preserve">Pour aller plus loin (facultatif)</w:t>
+      </w:r>
+      <w:r>
+        <w:t xml:space="preserve"> : les groupes qui le souhaitent peuvent rechercher comment restreindre ou exclure certains accès entre VLANs (p. ex. au moyen d’ACL).</w:t>
       </w:r>
     </w:p>
     <w:p>
@@ -1139,50 +927,7 @@
         <w:t>Les livrables attendus sont</w:t>
       </w:r>
       <w:r>
-        <w:t> : le schéma réseau (</w:t>
-      </w:r>
-      <w:proofErr w:type="gramStart"/>
-      <w:r>
-        <w:t>fichier .</w:t>
-      </w:r>
-      <w:proofErr w:type="spellStart"/>
-      <w:r>
-        <w:t>drawio</w:t>
-      </w:r>
-      <w:proofErr w:type="spellEnd"/>
-      <w:proofErr w:type="gramEnd"/>
-      <w:r>
-        <w:t xml:space="preserve"> </w:t>
-      </w:r>
-      <w:proofErr w:type="gramStart"/>
-      <w:r>
-        <w:t>ou</w:t>
-      </w:r>
-      <w:proofErr w:type="gramEnd"/>
-      <w:r>
-        <w:t xml:space="preserve"> .</w:t>
-      </w:r>
-      <w:proofErr w:type="spellStart"/>
-      <w:r>
-        <w:t>vsd</w:t>
-      </w:r>
-      <w:proofErr w:type="spellEnd"/>
-      <w:r>
-        <w:t xml:space="preserve">), le plan d’adressage (document PDF ou </w:t>
-      </w:r>
-      <w:r>
-        <w:t>EXCEL</w:t>
-      </w:r>
-      <w:r>
-        <w:t>), le fichier Packet Tracer (.</w:t>
-      </w:r>
-      <w:proofErr w:type="spellStart"/>
-      <w:r>
-        <w:t>pkt</w:t>
-      </w:r>
-      <w:proofErr w:type="spellEnd"/>
-      <w:r>
-        <w:t>), le journal de travail (.txt) et la présentation (PowerPoint ou PDF).</w:t>
+        <w:t xml:space="preserve"> : le schéma réseau (fichier .drawio ou .vsd), le plan d’adressage (document PDF ou EXCEL), le fichier Packet Tracer (.pkt), le journal de travail (.md), la documentation de configuration (.docx ou .md, commandes utilisées et explication de la configuration) et la présentation (PowerPoint ou PDF).</w:t>
       </w:r>
     </w:p>
     <w:p>
@@ -1274,15 +1019,19 @@
               </w:numPr>
             </w:pPr>
             <w:r>
-              <w:t>Simulation Packet Tracer (.</w:t>
+              <w:t>Simulation Packet Tracer (.pkt)</w:t>
             </w:r>
-            <w:proofErr w:type="spellStart"/>
+          </w:p>
+          <w:p>
+            <w:pPr>
+              <w:pStyle w:val="Paragraphedeliste"/>
+              <w:numPr>
+                <w:ilvl w:val="0"/>
+                <w:numId w:val="33"/>
+              </w:numPr>
+            </w:pPr>
             <w:r>
-              <w:t>pkt</w:t>
-            </w:r>
-            <w:proofErr w:type="spellEnd"/>
-            <w:r>
-              <w:t>)</w:t>
+              <w:t>Documentation de configuration (.docx ou .md) : commandes utilisées et explication de la configuration</w:t>
             </w:r>
           </w:p>
           <w:p>

</xml_diff>